<commit_message>
Add the live Vercel URL and fix the repository links
Co-Authored-By: Claude Opus 5.5 <noreply@anthropic.com>
</commit_message>
<xml_diff>
--- a/submissions/taproot/Taproot_Submission.docx
+++ b/submissions/taproot/Taproot_Submission.docx
@@ -94,7 +94,7 @@
         <w:t xml:space="preserve">Code repository: </w:t>
       </w:r>
       <w:r>
-        <w:t>https://github.com/akshayavinash2006/taproot</w:t>
+        <w:t>https://github.com/aditya-sridhar-git/Craft-N-Code-Karnataka</w:t>
       </w:r>
     </w:p>
     <w:p>
@@ -136,7 +136,7 @@
         <w:t xml:space="preserve">Deployed URL (optional): </w:t>
       </w:r>
       <w:r>
-        <w:t>[paste Vercel URL after deploying]</w:t>
+        <w:t>https://craft-n-code-karnataka.vercel.app</w:t>
       </w:r>
     </w:p>
     <w:p>

</xml_diff>

<commit_message>
Fill in college and team members
Co-Authored-By: Claude Opus 5.5 <noreply@anthropic.com>
</commit_message>
<xml_diff>
--- a/submissions/taproot/Taproot_Submission.docx
+++ b/submissions/taproot/Taproot_Submission.docx
@@ -48,7 +48,7 @@
         <w:t xml:space="preserve">College: </w:t>
       </w:r>
       <w:r>
-        <w:t>[fill in your college]</w:t>
+        <w:t>RV College of Engineering</w:t>
       </w:r>
     </w:p>
     <w:p>
@@ -59,7 +59,7 @@
         <w:t xml:space="preserve">Team members: </w:t>
       </w:r>
       <w:r>
-        <w:t>[fill in team member names]</w:t>
+        <w:t>Aditya Sridhar, Akshay Avinash, Aaryan Sanjay Ganvkar, Aniket Kiran Hegde</w:t>
       </w:r>
     </w:p>
     <w:p>

</xml_diff>